<commit_message>
Porta la versione anche nel frontespizio e nella testata
La v0.5 si dichiarava ancora 0.4 in copertina e v0.3 nella testata di
pagina: la versione non sta solo nella tabella della Storia, il template
la ripete nel riquadro di testa (righe Versione e Documento) e in una
cella della testata. L'utente l'ha corretta a mano in Word; qui la
correzione entra nel repository insieme alla nuova primitiva
docx_comune.frontespizio(), che aggiorna tutti e tre i posti, e alla sua
chiamata nello script della v0.5 perche' una riesecuzione sia corretta.

Comprende il salvataggio della v0.5 fatto in Word, che oltre alla
versione cambia la descrizione di S1 in "l'opzione preferibile delle
analisi di partenza".

Escluse dal repository le impostazioni personali di Claude Code
(.claude/settings.local.json): sono di chi lavora, non del progetto.

Co-Authored-By: Claude Opus 5 (1M context) <noreply@anthropic.com>
</commit_message>
<xml_diff>
--- a/Documenti finali/ANALISI_Identita-Profilazione-IAM_v0.5.docx
+++ b/Documenti finali/ANALISI_Identita-Profilazione-IAM_v0.5.docx
@@ -781,7 +781,13 @@
               <w:rPr>
                 <w:lang w:val="it-IT"/>
               </w:rPr>
-              <w:t>0.4</w:t>
+              <w:t>0.</w:t>
+            </w:r>
+            <w:r>
+              <w:rPr>
+                <w:lang w:val="it-IT"/>
+              </w:rPr>
+              <w:t>5</w:t>
             </w:r>
           </w:p>
         </w:tc>
@@ -845,7 +851,13 @@
               <w:rPr>
                 <w:lang w:val="it-IT"/>
               </w:rPr>
-              <w:t>ANALISI_Identita-Profilazione-IAM_v0.4</w:t>
+              <w:t>ANALISI_Identita-Profilazione-IAM_v0.</w:t>
+            </w:r>
+            <w:r>
+              <w:rPr>
+                <w:lang w:val="it-IT"/>
+              </w:rPr>
+              <w:t>5</w:t>
             </w:r>
           </w:p>
         </w:tc>
@@ -2164,7 +2176,7 @@
             </w:rPr>
             <w:fldChar w:fldCharType="separate"/>
           </w:r>
-          <w:hyperlink w:anchor="_Toc242794388" w:history="1">
+          <w:hyperlink w:anchor="_Toc242796230" w:history="1">
             <w:r>
               <w:rPr>
                 <w:rStyle w:val="Collegamentoipertestuale"/>
@@ -2208,7 +2220,7 @@
                 <w:noProof/>
                 <w:webHidden/>
               </w:rPr>
-              <w:instrText xml:space="preserve"> PAGEREF _Toc242794388 \h </w:instrText>
+              <w:instrText xml:space="preserve"> PAGEREF _Toc242796230 \h </w:instrText>
             </w:r>
             <w:r>
               <w:rPr>
@@ -2252,7 +2264,7 @@
               <w:lang w:val="it-IT" w:eastAsia="it-IT"/>
             </w:rPr>
           </w:pPr>
-          <w:hyperlink w:anchor="_Toc242794389" w:history="1">
+          <w:hyperlink w:anchor="_Toc242796231" w:history="1">
             <w:r>
               <w:rPr>
                 <w:rStyle w:val="Collegamentoipertestuale"/>
@@ -2296,7 +2308,7 @@
                 <w:noProof/>
                 <w:webHidden/>
               </w:rPr>
-              <w:instrText xml:space="preserve"> PAGEREF _Toc242794389 \h </w:instrText>
+              <w:instrText xml:space="preserve"> PAGEREF _Toc242796231 \h </w:instrText>
             </w:r>
             <w:r>
               <w:rPr>
@@ -2340,7 +2352,7 @@
               <w:lang w:val="it-IT" w:eastAsia="it-IT"/>
             </w:rPr>
           </w:pPr>
-          <w:hyperlink w:anchor="_Toc242794390" w:history="1">
+          <w:hyperlink w:anchor="_Toc242796232" w:history="1">
             <w:r>
               <w:rPr>
                 <w:rStyle w:val="Collegamentoipertestuale"/>
@@ -2384,7 +2396,7 @@
                 <w:noProof/>
                 <w:webHidden/>
               </w:rPr>
-              <w:instrText xml:space="preserve"> PAGEREF _Toc242794390 \h </w:instrText>
+              <w:instrText xml:space="preserve"> PAGEREF _Toc242796232 \h </w:instrText>
             </w:r>
             <w:r>
               <w:rPr>
@@ -2428,7 +2440,7 @@
               <w:lang w:val="it-IT" w:eastAsia="it-IT"/>
             </w:rPr>
           </w:pPr>
-          <w:hyperlink w:anchor="_Toc242794391" w:history="1">
+          <w:hyperlink w:anchor="_Toc242796233" w:history="1">
             <w:r>
               <w:rPr>
                 <w:rStyle w:val="Collegamentoipertestuale"/>
@@ -2472,7 +2484,7 @@
                 <w:noProof/>
                 <w:webHidden/>
               </w:rPr>
-              <w:instrText xml:space="preserve"> PAGEREF _Toc242794391 \h </w:instrText>
+              <w:instrText xml:space="preserve"> PAGEREF _Toc242796233 \h </w:instrText>
             </w:r>
             <w:r>
               <w:rPr>
@@ -2516,7 +2528,7 @@
               <w:lang w:val="it-IT" w:eastAsia="it-IT"/>
             </w:rPr>
           </w:pPr>
-          <w:hyperlink w:anchor="_Toc242794392" w:history="1">
+          <w:hyperlink w:anchor="_Toc242796234" w:history="1">
             <w:r>
               <w:rPr>
                 <w:rStyle w:val="Collegamentoipertestuale"/>
@@ -2560,7 +2572,7 @@
                 <w:noProof/>
                 <w:webHidden/>
               </w:rPr>
-              <w:instrText xml:space="preserve"> PAGEREF _Toc242794392 \h </w:instrText>
+              <w:instrText xml:space="preserve"> PAGEREF _Toc242796234 \h </w:instrText>
             </w:r>
             <w:r>
               <w:rPr>
@@ -2604,7 +2616,7 @@
               <w:lang w:val="it-IT" w:eastAsia="it-IT"/>
             </w:rPr>
           </w:pPr>
-          <w:hyperlink w:anchor="_Toc242794393" w:history="1">
+          <w:hyperlink w:anchor="_Toc242796235" w:history="1">
             <w:r>
               <w:rPr>
                 <w:rStyle w:val="Collegamentoipertestuale"/>
@@ -2648,7 +2660,7 @@
                 <w:noProof/>
                 <w:webHidden/>
               </w:rPr>
-              <w:instrText xml:space="preserve"> PAGEREF _Toc242794393 \h </w:instrText>
+              <w:instrText xml:space="preserve"> PAGEREF _Toc242796235 \h </w:instrText>
             </w:r>
             <w:r>
               <w:rPr>
@@ -2692,7 +2704,7 @@
               <w:lang w:val="it-IT" w:eastAsia="it-IT"/>
             </w:rPr>
           </w:pPr>
-          <w:hyperlink w:anchor="_Toc242794394" w:history="1">
+          <w:hyperlink w:anchor="_Toc242796236" w:history="1">
             <w:r>
               <w:rPr>
                 <w:rStyle w:val="Collegamentoipertestuale"/>
@@ -2736,7 +2748,7 @@
                 <w:noProof/>
                 <w:webHidden/>
               </w:rPr>
-              <w:instrText xml:space="preserve"> PAGEREF _Toc242794394 \h </w:instrText>
+              <w:instrText xml:space="preserve"> PAGEREF _Toc242796236 \h </w:instrText>
             </w:r>
             <w:r>
               <w:rPr>
@@ -2780,7 +2792,7 @@
               <w:lang w:val="it-IT" w:eastAsia="it-IT"/>
             </w:rPr>
           </w:pPr>
-          <w:hyperlink w:anchor="_Toc242794395" w:history="1">
+          <w:hyperlink w:anchor="_Toc242796237" w:history="1">
             <w:r>
               <w:rPr>
                 <w:rStyle w:val="Collegamentoipertestuale"/>
@@ -2824,7 +2836,7 @@
                 <w:noProof/>
                 <w:webHidden/>
               </w:rPr>
-              <w:instrText xml:space="preserve"> PAGEREF _Toc242794395 \h </w:instrText>
+              <w:instrText xml:space="preserve"> PAGEREF _Toc242796237 \h </w:instrText>
             </w:r>
             <w:r>
               <w:rPr>
@@ -2868,7 +2880,7 @@
               <w:lang w:val="it-IT" w:eastAsia="it-IT"/>
             </w:rPr>
           </w:pPr>
-          <w:hyperlink w:anchor="_Toc242794396" w:history="1">
+          <w:hyperlink w:anchor="_Toc242796238" w:history="1">
             <w:r>
               <w:rPr>
                 <w:rStyle w:val="Collegamentoipertestuale"/>
@@ -2912,7 +2924,7 @@
                 <w:noProof/>
                 <w:webHidden/>
               </w:rPr>
-              <w:instrText xml:space="preserve"> PAGEREF _Toc242794396 \h </w:instrText>
+              <w:instrText xml:space="preserve"> PAGEREF _Toc242796238 \h </w:instrText>
             </w:r>
             <w:r>
               <w:rPr>
@@ -2956,7 +2968,7 @@
               <w:lang w:val="it-IT" w:eastAsia="it-IT"/>
             </w:rPr>
           </w:pPr>
-          <w:hyperlink w:anchor="_Toc242794397" w:history="1">
+          <w:hyperlink w:anchor="_Toc242796239" w:history="1">
             <w:r>
               <w:rPr>
                 <w:rStyle w:val="Collegamentoipertestuale"/>
@@ -3000,7 +3012,7 @@
                 <w:noProof/>
                 <w:webHidden/>
               </w:rPr>
-              <w:instrText xml:space="preserve"> PAGEREF _Toc242794397 \h </w:instrText>
+              <w:instrText xml:space="preserve"> PAGEREF _Toc242796239 \h </w:instrText>
             </w:r>
             <w:r>
               <w:rPr>
@@ -3044,7 +3056,7 @@
               <w:lang w:val="it-IT" w:eastAsia="it-IT"/>
             </w:rPr>
           </w:pPr>
-          <w:hyperlink w:anchor="_Toc242794398" w:history="1">
+          <w:hyperlink w:anchor="_Toc242796240" w:history="1">
             <w:r>
               <w:rPr>
                 <w:rStyle w:val="Collegamentoipertestuale"/>
@@ -3088,7 +3100,7 @@
                 <w:noProof/>
                 <w:webHidden/>
               </w:rPr>
-              <w:instrText xml:space="preserve"> PAGEREF _Toc242794398 \h </w:instrText>
+              <w:instrText xml:space="preserve"> PAGEREF _Toc242796240 \h </w:instrText>
             </w:r>
             <w:r>
               <w:rPr>
@@ -3132,7 +3144,7 @@
               <w:lang w:val="it-IT" w:eastAsia="it-IT"/>
             </w:rPr>
           </w:pPr>
-          <w:hyperlink w:anchor="_Toc242794399" w:history="1">
+          <w:hyperlink w:anchor="_Toc242796241" w:history="1">
             <w:r>
               <w:rPr>
                 <w:rStyle w:val="Collegamentoipertestuale"/>
@@ -3176,7 +3188,7 @@
                 <w:noProof/>
                 <w:webHidden/>
               </w:rPr>
-              <w:instrText xml:space="preserve"> PAGEREF _Toc242794399 \h </w:instrText>
+              <w:instrText xml:space="preserve"> PAGEREF _Toc242796241 \h </w:instrText>
             </w:r>
             <w:r>
               <w:rPr>
@@ -3220,7 +3232,7 @@
               <w:lang w:val="it-IT" w:eastAsia="it-IT"/>
             </w:rPr>
           </w:pPr>
-          <w:hyperlink w:anchor="_Toc242794400" w:history="1">
+          <w:hyperlink w:anchor="_Toc242796242" w:history="1">
             <w:r>
               <w:rPr>
                 <w:rStyle w:val="Collegamentoipertestuale"/>
@@ -3264,7 +3276,7 @@
                 <w:noProof/>
                 <w:webHidden/>
               </w:rPr>
-              <w:instrText xml:space="preserve"> PAGEREF _Toc242794400 \h </w:instrText>
+              <w:instrText xml:space="preserve"> PAGEREF _Toc242796242 \h </w:instrText>
             </w:r>
             <w:r>
               <w:rPr>
@@ -3308,7 +3320,7 @@
               <w:lang w:val="it-IT" w:eastAsia="it-IT"/>
             </w:rPr>
           </w:pPr>
-          <w:hyperlink w:anchor="_Toc242794401" w:history="1">
+          <w:hyperlink w:anchor="_Toc242796243" w:history="1">
             <w:r>
               <w:rPr>
                 <w:rStyle w:val="Collegamentoipertestuale"/>
@@ -3352,7 +3364,7 @@
                 <w:noProof/>
                 <w:webHidden/>
               </w:rPr>
-              <w:instrText xml:space="preserve"> PAGEREF _Toc242794401 \h </w:instrText>
+              <w:instrText xml:space="preserve"> PAGEREF _Toc242796243 \h </w:instrText>
             </w:r>
             <w:r>
               <w:rPr>
@@ -3396,7 +3408,7 @@
               <w:lang w:val="it-IT" w:eastAsia="it-IT"/>
             </w:rPr>
           </w:pPr>
-          <w:hyperlink w:anchor="_Toc242794402" w:history="1">
+          <w:hyperlink w:anchor="_Toc242796244" w:history="1">
             <w:r>
               <w:rPr>
                 <w:rStyle w:val="Collegamentoipertestuale"/>
@@ -3440,7 +3452,7 @@
                 <w:noProof/>
                 <w:webHidden/>
               </w:rPr>
-              <w:instrText xml:space="preserve"> PAGEREF _Toc242794402 \h </w:instrText>
+              <w:instrText xml:space="preserve"> PAGEREF _Toc242796244 \h </w:instrText>
             </w:r>
             <w:r>
               <w:rPr>
@@ -3484,7 +3496,7 @@
               <w:lang w:val="it-IT" w:eastAsia="it-IT"/>
             </w:rPr>
           </w:pPr>
-          <w:hyperlink w:anchor="_Toc242794403" w:history="1">
+          <w:hyperlink w:anchor="_Toc242796245" w:history="1">
             <w:r>
               <w:rPr>
                 <w:rStyle w:val="Collegamentoipertestuale"/>
@@ -3528,7 +3540,7 @@
                 <w:noProof/>
                 <w:webHidden/>
               </w:rPr>
-              <w:instrText xml:space="preserve"> PAGEREF _Toc242794403 \h </w:instrText>
+              <w:instrText xml:space="preserve"> PAGEREF _Toc242796245 \h </w:instrText>
             </w:r>
             <w:r>
               <w:rPr>
@@ -3572,7 +3584,7 @@
               <w:lang w:val="it-IT" w:eastAsia="it-IT"/>
             </w:rPr>
           </w:pPr>
-          <w:hyperlink w:anchor="_Toc242794404" w:history="1">
+          <w:hyperlink w:anchor="_Toc242796246" w:history="1">
             <w:r>
               <w:rPr>
                 <w:rStyle w:val="Collegamentoipertestuale"/>
@@ -3618,7 +3630,7 @@
                 <w:noProof/>
                 <w:webHidden/>
               </w:rPr>
-              <w:instrText xml:space="preserve"> PAGEREF _Toc242794404 \h </w:instrText>
+              <w:instrText xml:space="preserve"> PAGEREF _Toc242796246 \h </w:instrText>
             </w:r>
             <w:r>
               <w:rPr>
@@ -3662,7 +3674,7 @@
               <w:lang w:val="it-IT" w:eastAsia="it-IT"/>
             </w:rPr>
           </w:pPr>
-          <w:hyperlink w:anchor="_Toc242794405" w:history="1">
+          <w:hyperlink w:anchor="_Toc242796247" w:history="1">
             <w:r>
               <w:rPr>
                 <w:rStyle w:val="Collegamentoipertestuale"/>
@@ -3708,7 +3720,7 @@
                 <w:noProof/>
                 <w:webHidden/>
               </w:rPr>
-              <w:instrText xml:space="preserve"> PAGEREF _Toc242794405 \h </w:instrText>
+              <w:instrText xml:space="preserve"> PAGEREF _Toc242796247 \h </w:instrText>
             </w:r>
             <w:r>
               <w:rPr>
@@ -3752,7 +3764,7 @@
               <w:lang w:val="it-IT" w:eastAsia="it-IT"/>
             </w:rPr>
           </w:pPr>
-          <w:hyperlink w:anchor="_Toc242794406" w:history="1">
+          <w:hyperlink w:anchor="_Toc242796248" w:history="1">
             <w:r>
               <w:rPr>
                 <w:rStyle w:val="Collegamentoipertestuale"/>
@@ -3798,7 +3810,7 @@
                 <w:noProof/>
                 <w:webHidden/>
               </w:rPr>
-              <w:instrText xml:space="preserve"> PAGEREF _Toc242794406 \h </w:instrText>
+              <w:instrText xml:space="preserve"> PAGEREF _Toc242796248 \h </w:instrText>
             </w:r>
             <w:r>
               <w:rPr>
@@ -3842,7 +3854,7 @@
               <w:lang w:val="it-IT" w:eastAsia="it-IT"/>
             </w:rPr>
           </w:pPr>
-          <w:hyperlink w:anchor="_Toc242794407" w:history="1">
+          <w:hyperlink w:anchor="_Toc242796249" w:history="1">
             <w:r>
               <w:rPr>
                 <w:rStyle w:val="Collegamentoipertestuale"/>
@@ -3888,7 +3900,7 @@
                 <w:noProof/>
                 <w:webHidden/>
               </w:rPr>
-              <w:instrText xml:space="preserve"> PAGEREF _Toc242794407 \h </w:instrText>
+              <w:instrText xml:space="preserve"> PAGEREF _Toc242796249 \h </w:instrText>
             </w:r>
             <w:r>
               <w:rPr>
@@ -3932,7 +3944,7 @@
               <w:lang w:val="it-IT" w:eastAsia="it-IT"/>
             </w:rPr>
           </w:pPr>
-          <w:hyperlink w:anchor="_Toc242794408" w:history="1">
+          <w:hyperlink w:anchor="_Toc242796250" w:history="1">
             <w:r>
               <w:rPr>
                 <w:rStyle w:val="Collegamentoipertestuale"/>
@@ -3978,7 +3990,7 @@
                 <w:noProof/>
                 <w:webHidden/>
               </w:rPr>
-              <w:instrText xml:space="preserve"> PAGEREF _Toc242794408 \h </w:instrText>
+              <w:instrText xml:space="preserve"> PAGEREF _Toc242796250 \h </w:instrText>
             </w:r>
             <w:r>
               <w:rPr>
@@ -4022,7 +4034,7 @@
               <w:lang w:val="it-IT" w:eastAsia="it-IT"/>
             </w:rPr>
           </w:pPr>
-          <w:hyperlink w:anchor="_Toc242794409" w:history="1">
+          <w:hyperlink w:anchor="_Toc242796251" w:history="1">
             <w:r>
               <w:rPr>
                 <w:rStyle w:val="Collegamentoipertestuale"/>
@@ -4068,7 +4080,7 @@
                 <w:noProof/>
                 <w:webHidden/>
               </w:rPr>
-              <w:instrText xml:space="preserve"> PAGEREF _Toc242794409 \h </w:instrText>
+              <w:instrText xml:space="preserve"> PAGEREF _Toc242796251 \h </w:instrText>
             </w:r>
             <w:r>
               <w:rPr>
@@ -4112,7 +4124,7 @@
               <w:lang w:val="it-IT" w:eastAsia="it-IT"/>
             </w:rPr>
           </w:pPr>
-          <w:hyperlink w:anchor="_Toc242794410" w:history="1">
+          <w:hyperlink w:anchor="_Toc242796252" w:history="1">
             <w:r>
               <w:rPr>
                 <w:rStyle w:val="Collegamentoipertestuale"/>
@@ -4156,7 +4168,7 @@
                 <w:noProof/>
                 <w:webHidden/>
               </w:rPr>
-              <w:instrText xml:space="preserve"> PAGEREF _Toc242794410 \h </w:instrText>
+              <w:instrText xml:space="preserve"> PAGEREF _Toc242796252 \h </w:instrText>
             </w:r>
             <w:r>
               <w:rPr>
@@ -4200,7 +4212,7 @@
               <w:lang w:val="it-IT" w:eastAsia="it-IT"/>
             </w:rPr>
           </w:pPr>
-          <w:hyperlink w:anchor="_Toc242794411" w:history="1">
+          <w:hyperlink w:anchor="_Toc242796253" w:history="1">
             <w:r>
               <w:rPr>
                 <w:rStyle w:val="Collegamentoipertestuale"/>
@@ -4244,7 +4256,7 @@
                 <w:noProof/>
                 <w:webHidden/>
               </w:rPr>
-              <w:instrText xml:space="preserve"> PAGEREF _Toc242794411 \h </w:instrText>
+              <w:instrText xml:space="preserve"> PAGEREF _Toc242796253 \h </w:instrText>
             </w:r>
             <w:r>
               <w:rPr>
@@ -4288,7 +4300,7 @@
               <w:lang w:val="it-IT" w:eastAsia="it-IT"/>
             </w:rPr>
           </w:pPr>
-          <w:hyperlink w:anchor="_Toc242794412" w:history="1">
+          <w:hyperlink w:anchor="_Toc242796254" w:history="1">
             <w:r>
               <w:rPr>
                 <w:rStyle w:val="Collegamentoipertestuale"/>
@@ -4332,7 +4344,7 @@
                 <w:noProof/>
                 <w:webHidden/>
               </w:rPr>
-              <w:instrText xml:space="preserve"> PAGEREF _Toc242794412 \h </w:instrText>
+              <w:instrText xml:space="preserve"> PAGEREF _Toc242796254 \h </w:instrText>
             </w:r>
             <w:r>
               <w:rPr>
@@ -4376,7 +4388,7 @@
               <w:lang w:val="it-IT" w:eastAsia="it-IT"/>
             </w:rPr>
           </w:pPr>
-          <w:hyperlink w:anchor="_Toc242794413" w:history="1">
+          <w:hyperlink w:anchor="_Toc242796255" w:history="1">
             <w:r>
               <w:rPr>
                 <w:rStyle w:val="Collegamentoipertestuale"/>
@@ -4420,7 +4432,7 @@
                 <w:noProof/>
                 <w:webHidden/>
               </w:rPr>
-              <w:instrText xml:space="preserve"> PAGEREF _Toc242794413 \h </w:instrText>
+              <w:instrText xml:space="preserve"> PAGEREF _Toc242796255 \h </w:instrText>
             </w:r>
             <w:r>
               <w:rPr>
@@ -4464,7 +4476,7 @@
               <w:lang w:val="it-IT" w:eastAsia="it-IT"/>
             </w:rPr>
           </w:pPr>
-          <w:hyperlink w:anchor="_Toc242794414" w:history="1">
+          <w:hyperlink w:anchor="_Toc242796256" w:history="1">
             <w:r>
               <w:rPr>
                 <w:rStyle w:val="Collegamentoipertestuale"/>
@@ -4508,7 +4520,7 @@
                 <w:noProof/>
                 <w:webHidden/>
               </w:rPr>
-              <w:instrText xml:space="preserve"> PAGEREF _Toc242794414 \h </w:instrText>
+              <w:instrText xml:space="preserve"> PAGEREF _Toc242796256 \h </w:instrText>
             </w:r>
             <w:r>
               <w:rPr>
@@ -4552,7 +4564,7 @@
               <w:lang w:val="it-IT" w:eastAsia="it-IT"/>
             </w:rPr>
           </w:pPr>
-          <w:hyperlink w:anchor="_Toc242794415" w:history="1">
+          <w:hyperlink w:anchor="_Toc242796257" w:history="1">
             <w:r>
               <w:rPr>
                 <w:rStyle w:val="Collegamentoipertestuale"/>
@@ -4594,7 +4606,7 @@
                 <w:noProof/>
                 <w:webHidden/>
               </w:rPr>
-              <w:instrText xml:space="preserve"> PAGEREF _Toc242794415 \h </w:instrText>
+              <w:instrText xml:space="preserve"> PAGEREF _Toc242796257 \h </w:instrText>
             </w:r>
             <w:r>
               <w:rPr>
@@ -4638,7 +4650,7 @@
               <w:lang w:val="it-IT" w:eastAsia="it-IT"/>
             </w:rPr>
           </w:pPr>
-          <w:hyperlink w:anchor="_Toc242794416" w:history="1">
+          <w:hyperlink w:anchor="_Toc242796258" w:history="1">
             <w:r>
               <w:rPr>
                 <w:rStyle w:val="Collegamentoipertestuale"/>
@@ -4680,7 +4692,7 @@
                 <w:noProof/>
                 <w:webHidden/>
               </w:rPr>
-              <w:instrText xml:space="preserve"> PAGEREF _Toc242794416 \h </w:instrText>
+              <w:instrText xml:space="preserve"> PAGEREF _Toc242796258 \h </w:instrText>
             </w:r>
             <w:r>
               <w:rPr>
@@ -4724,7 +4736,7 @@
               <w:lang w:val="it-IT" w:eastAsia="it-IT"/>
             </w:rPr>
           </w:pPr>
-          <w:hyperlink w:anchor="_Toc242794417" w:history="1">
+          <w:hyperlink w:anchor="_Toc242796259" w:history="1">
             <w:r>
               <w:rPr>
                 <w:rStyle w:val="Collegamentoipertestuale"/>
@@ -4766,7 +4778,7 @@
                 <w:noProof/>
                 <w:webHidden/>
               </w:rPr>
-              <w:instrText xml:space="preserve"> PAGEREF _Toc242794417 \h </w:instrText>
+              <w:instrText xml:space="preserve"> PAGEREF _Toc242796259 \h </w:instrText>
             </w:r>
             <w:r>
               <w:rPr>
@@ -4810,7 +4822,7 @@
               <w:lang w:val="it-IT" w:eastAsia="it-IT"/>
             </w:rPr>
           </w:pPr>
-          <w:hyperlink w:anchor="_Toc242794418" w:history="1">
+          <w:hyperlink w:anchor="_Toc242796260" w:history="1">
             <w:r>
               <w:rPr>
                 <w:rStyle w:val="Collegamentoipertestuale"/>
@@ -4852,7 +4864,7 @@
                 <w:noProof/>
                 <w:webHidden/>
               </w:rPr>
-              <w:instrText xml:space="preserve"> PAGEREF _Toc242794418 \h </w:instrText>
+              <w:instrText xml:space="preserve"> PAGEREF _Toc242796260 \h </w:instrText>
             </w:r>
             <w:r>
               <w:rPr>
@@ -4896,7 +4908,7 @@
               <w:lang w:val="it-IT" w:eastAsia="it-IT"/>
             </w:rPr>
           </w:pPr>
-          <w:hyperlink w:anchor="_Toc242794419" w:history="1">
+          <w:hyperlink w:anchor="_Toc242796261" w:history="1">
             <w:r>
               <w:rPr>
                 <w:rStyle w:val="Collegamentoipertestuale"/>
@@ -4938,7 +4950,7 @@
                 <w:noProof/>
                 <w:webHidden/>
               </w:rPr>
-              <w:instrText xml:space="preserve"> PAGEREF _Toc242794419 \h </w:instrText>
+              <w:instrText xml:space="preserve"> PAGEREF _Toc242796261 \h </w:instrText>
             </w:r>
             <w:r>
               <w:rPr>
@@ -4982,7 +4994,7 @@
               <w:lang w:val="it-IT" w:eastAsia="it-IT"/>
             </w:rPr>
           </w:pPr>
-          <w:hyperlink w:anchor="_Toc242794420" w:history="1">
+          <w:hyperlink w:anchor="_Toc242796262" w:history="1">
             <w:r>
               <w:rPr>
                 <w:rStyle w:val="Collegamentoipertestuale"/>
@@ -5024,7 +5036,7 @@
                 <w:noProof/>
                 <w:webHidden/>
               </w:rPr>
-              <w:instrText xml:space="preserve"> PAGEREF _Toc242794420 \h </w:instrText>
+              <w:instrText xml:space="preserve"> PAGEREF _Toc242796262 \h </w:instrText>
             </w:r>
             <w:r>
               <w:rPr>
@@ -5068,7 +5080,7 @@
               <w:lang w:val="it-IT" w:eastAsia="it-IT"/>
             </w:rPr>
           </w:pPr>
-          <w:hyperlink w:anchor="_Toc242794421" w:history="1">
+          <w:hyperlink w:anchor="_Toc242796263" w:history="1">
             <w:r>
               <w:rPr>
                 <w:rStyle w:val="Collegamentoipertestuale"/>
@@ -5110,7 +5122,7 @@
                 <w:noProof/>
                 <w:webHidden/>
               </w:rPr>
-              <w:instrText xml:space="preserve"> PAGEREF _Toc242794421 \h </w:instrText>
+              <w:instrText xml:space="preserve"> PAGEREF _Toc242796263 \h </w:instrText>
             </w:r>
             <w:r>
               <w:rPr>
@@ -5154,7 +5166,7 @@
               <w:lang w:val="it-IT" w:eastAsia="it-IT"/>
             </w:rPr>
           </w:pPr>
-          <w:hyperlink w:anchor="_Toc242794422" w:history="1">
+          <w:hyperlink w:anchor="_Toc242796264" w:history="1">
             <w:r>
               <w:rPr>
                 <w:rStyle w:val="Collegamentoipertestuale"/>
@@ -5196,7 +5208,7 @@
                 <w:noProof/>
                 <w:webHidden/>
               </w:rPr>
-              <w:instrText xml:space="preserve"> PAGEREF _Toc242794422 \h </w:instrText>
+              <w:instrText xml:space="preserve"> PAGEREF _Toc242796264 \h </w:instrText>
             </w:r>
             <w:r>
               <w:rPr>
@@ -5240,7 +5252,7 @@
               <w:lang w:val="it-IT" w:eastAsia="it-IT"/>
             </w:rPr>
           </w:pPr>
-          <w:hyperlink w:anchor="_Toc242794423" w:history="1">
+          <w:hyperlink w:anchor="_Toc242796265" w:history="1">
             <w:r>
               <w:rPr>
                 <w:rStyle w:val="Collegamentoipertestuale"/>
@@ -5282,7 +5294,7 @@
                 <w:noProof/>
                 <w:webHidden/>
               </w:rPr>
-              <w:instrText xml:space="preserve"> PAGEREF _Toc242794423 \h </w:instrText>
+              <w:instrText xml:space="preserve"> PAGEREF _Toc242796265 \h </w:instrText>
             </w:r>
             <w:r>
               <w:rPr>
@@ -5326,7 +5338,7 @@
               <w:lang w:val="it-IT" w:eastAsia="it-IT"/>
             </w:rPr>
           </w:pPr>
-          <w:hyperlink w:anchor="_Toc242794424" w:history="1">
+          <w:hyperlink w:anchor="_Toc242796266" w:history="1">
             <w:r>
               <w:rPr>
                 <w:rStyle w:val="Collegamentoipertestuale"/>
@@ -5368,7 +5380,7 @@
                 <w:noProof/>
                 <w:webHidden/>
               </w:rPr>
-              <w:instrText xml:space="preserve"> PAGEREF _Toc242794424 \h </w:instrText>
+              <w:instrText xml:space="preserve"> PAGEREF _Toc242796266 \h </w:instrText>
             </w:r>
             <w:r>
               <w:rPr>
@@ -5412,7 +5424,7 @@
               <w:lang w:val="it-IT" w:eastAsia="it-IT"/>
             </w:rPr>
           </w:pPr>
-          <w:hyperlink w:anchor="_Toc242794425" w:history="1">
+          <w:hyperlink w:anchor="_Toc242796267" w:history="1">
             <w:r>
               <w:rPr>
                 <w:rStyle w:val="Collegamentoipertestuale"/>
@@ -5455,7 +5467,7 @@
                 <w:noProof/>
                 <w:webHidden/>
               </w:rPr>
-              <w:instrText xml:space="preserve"> PAGEREF _Toc242794425 \h </w:instrText>
+              <w:instrText xml:space="preserve"> PAGEREF _Toc242796267 \h </w:instrText>
             </w:r>
             <w:r>
               <w:rPr>
@@ -5499,7 +5511,7 @@
               <w:lang w:val="it-IT" w:eastAsia="it-IT"/>
             </w:rPr>
           </w:pPr>
-          <w:hyperlink w:anchor="_Toc242794426" w:history="1">
+          <w:hyperlink w:anchor="_Toc242796268" w:history="1">
             <w:r>
               <w:rPr>
                 <w:rStyle w:val="Collegamentoipertestuale"/>
@@ -5541,7 +5553,7 @@
                 <w:noProof/>
                 <w:webHidden/>
               </w:rPr>
-              <w:instrText xml:space="preserve"> PAGEREF _Toc242794426 \h </w:instrText>
+              <w:instrText xml:space="preserve"> PAGEREF _Toc242796268 \h </w:instrText>
             </w:r>
             <w:r>
               <w:rPr>
@@ -5585,7 +5597,7 @@
               <w:lang w:val="it-IT" w:eastAsia="it-IT"/>
             </w:rPr>
           </w:pPr>
-          <w:hyperlink w:anchor="_Toc242794427" w:history="1">
+          <w:hyperlink w:anchor="_Toc242796269" w:history="1">
             <w:r>
               <w:rPr>
                 <w:rStyle w:val="Collegamentoipertestuale"/>
@@ -5627,7 +5639,7 @@
                 <w:noProof/>
                 <w:webHidden/>
               </w:rPr>
-              <w:instrText xml:space="preserve"> PAGEREF _Toc242794427 \h </w:instrText>
+              <w:instrText xml:space="preserve"> PAGEREF _Toc242796269 \h </w:instrText>
             </w:r>
             <w:r>
               <w:rPr>
@@ -5671,7 +5683,7 @@
               <w:lang w:val="it-IT" w:eastAsia="it-IT"/>
             </w:rPr>
           </w:pPr>
-          <w:hyperlink w:anchor="_Toc242794428" w:history="1">
+          <w:hyperlink w:anchor="_Toc242796270" w:history="1">
             <w:r>
               <w:rPr>
                 <w:rStyle w:val="Collegamentoipertestuale"/>
@@ -5713,7 +5725,7 @@
                 <w:noProof/>
                 <w:webHidden/>
               </w:rPr>
-              <w:instrText xml:space="preserve"> PAGEREF _Toc242794428 \h </w:instrText>
+              <w:instrText xml:space="preserve"> PAGEREF _Toc242796270 \h </w:instrText>
             </w:r>
             <w:r>
               <w:rPr>
@@ -5757,7 +5769,7 @@
               <w:lang w:val="it-IT" w:eastAsia="it-IT"/>
             </w:rPr>
           </w:pPr>
-          <w:hyperlink w:anchor="_Toc242794429" w:history="1">
+          <w:hyperlink w:anchor="_Toc242796271" w:history="1">
             <w:r>
               <w:rPr>
                 <w:rStyle w:val="Collegamentoipertestuale"/>
@@ -5799,7 +5811,7 @@
                 <w:noProof/>
                 <w:webHidden/>
               </w:rPr>
-              <w:instrText xml:space="preserve"> PAGEREF _Toc242794429 \h </w:instrText>
+              <w:instrText xml:space="preserve"> PAGEREF _Toc242796271 \h </w:instrText>
             </w:r>
             <w:r>
               <w:rPr>
@@ -5843,7 +5855,7 @@
               <w:lang w:val="it-IT" w:eastAsia="it-IT"/>
             </w:rPr>
           </w:pPr>
-          <w:hyperlink w:anchor="_Toc242794430" w:history="1">
+          <w:hyperlink w:anchor="_Toc242796272" w:history="1">
             <w:r>
               <w:rPr>
                 <w:rStyle w:val="Collegamentoipertestuale"/>
@@ -5885,7 +5897,7 @@
                 <w:noProof/>
                 <w:webHidden/>
               </w:rPr>
-              <w:instrText xml:space="preserve"> PAGEREF _Toc242794430 \h </w:instrText>
+              <w:instrText xml:space="preserve"> PAGEREF _Toc242796272 \h </w:instrText>
             </w:r>
             <w:r>
               <w:rPr>
@@ -5929,7 +5941,7 @@
               <w:lang w:val="it-IT" w:eastAsia="it-IT"/>
             </w:rPr>
           </w:pPr>
-          <w:hyperlink w:anchor="_Toc242794431" w:history="1">
+          <w:hyperlink w:anchor="_Toc242796273" w:history="1">
             <w:r>
               <w:rPr>
                 <w:rStyle w:val="Collegamentoipertestuale"/>
@@ -5971,7 +5983,7 @@
                 <w:noProof/>
                 <w:webHidden/>
               </w:rPr>
-              <w:instrText xml:space="preserve"> PAGEREF _Toc242794431 \h </w:instrText>
+              <w:instrText xml:space="preserve"> PAGEREF _Toc242796273 \h </w:instrText>
             </w:r>
             <w:r>
               <w:rPr>
@@ -6015,7 +6027,7 @@
               <w:lang w:val="it-IT" w:eastAsia="it-IT"/>
             </w:rPr>
           </w:pPr>
-          <w:hyperlink w:anchor="_Toc242794432" w:history="1">
+          <w:hyperlink w:anchor="_Toc242796274" w:history="1">
             <w:r>
               <w:rPr>
                 <w:rStyle w:val="Collegamentoipertestuale"/>
@@ -6057,7 +6069,7 @@
                 <w:noProof/>
                 <w:webHidden/>
               </w:rPr>
-              <w:instrText xml:space="preserve"> PAGEREF _Toc242794432 \h </w:instrText>
+              <w:instrText xml:space="preserve"> PAGEREF _Toc242796274 \h </w:instrText>
             </w:r>
             <w:r>
               <w:rPr>
@@ -6101,7 +6113,7 @@
               <w:lang w:val="it-IT" w:eastAsia="it-IT"/>
             </w:rPr>
           </w:pPr>
-          <w:hyperlink w:anchor="_Toc242794433" w:history="1">
+          <w:hyperlink w:anchor="_Toc242796275" w:history="1">
             <w:r>
               <w:rPr>
                 <w:rStyle w:val="Collegamentoipertestuale"/>
@@ -6143,7 +6155,7 @@
                 <w:noProof/>
                 <w:webHidden/>
               </w:rPr>
-              <w:instrText xml:space="preserve"> PAGEREF _Toc242794433 \h </w:instrText>
+              <w:instrText xml:space="preserve"> PAGEREF _Toc242796275 \h </w:instrText>
             </w:r>
             <w:r>
               <w:rPr>
@@ -6187,7 +6199,7 @@
               <w:lang w:val="it-IT" w:eastAsia="it-IT"/>
             </w:rPr>
           </w:pPr>
-          <w:hyperlink w:anchor="_Toc242794434" w:history="1">
+          <w:hyperlink w:anchor="_Toc242796276" w:history="1">
             <w:r>
               <w:rPr>
                 <w:rStyle w:val="Collegamentoipertestuale"/>
@@ -6229,7 +6241,7 @@
                 <w:noProof/>
                 <w:webHidden/>
               </w:rPr>
-              <w:instrText xml:space="preserve"> PAGEREF _Toc242794434 \h </w:instrText>
+              <w:instrText xml:space="preserve"> PAGEREF _Toc242796276 \h </w:instrText>
             </w:r>
             <w:r>
               <w:rPr>
@@ -6273,7 +6285,7 @@
               <w:lang w:val="it-IT" w:eastAsia="it-IT"/>
             </w:rPr>
           </w:pPr>
-          <w:hyperlink w:anchor="_Toc242794435" w:history="1">
+          <w:hyperlink w:anchor="_Toc242796277" w:history="1">
             <w:r>
               <w:rPr>
                 <w:rStyle w:val="Collegamentoipertestuale"/>
@@ -6315,7 +6327,7 @@
                 <w:noProof/>
                 <w:webHidden/>
               </w:rPr>
-              <w:instrText xml:space="preserve"> PAGEREF _Toc242794435 \h </w:instrText>
+              <w:instrText xml:space="preserve"> PAGEREF _Toc242796277 \h </w:instrText>
             </w:r>
             <w:r>
               <w:rPr>
@@ -6359,7 +6371,7 @@
               <w:lang w:val="it-IT" w:eastAsia="it-IT"/>
             </w:rPr>
           </w:pPr>
-          <w:hyperlink w:anchor="_Toc242794436" w:history="1">
+          <w:hyperlink w:anchor="_Toc242796278" w:history="1">
             <w:r>
               <w:rPr>
                 <w:rStyle w:val="Collegamentoipertestuale"/>
@@ -6401,7 +6413,7 @@
                 <w:noProof/>
                 <w:webHidden/>
               </w:rPr>
-              <w:instrText xml:space="preserve"> PAGEREF _Toc242794436 \h </w:instrText>
+              <w:instrText xml:space="preserve"> PAGEREF _Toc242796278 \h </w:instrText>
             </w:r>
             <w:r>
               <w:rPr>
@@ -6445,7 +6457,7 @@
               <w:lang w:val="it-IT" w:eastAsia="it-IT"/>
             </w:rPr>
           </w:pPr>
-          <w:hyperlink w:anchor="_Toc242794437" w:history="1">
+          <w:hyperlink w:anchor="_Toc242796279" w:history="1">
             <w:r>
               <w:rPr>
                 <w:rStyle w:val="Collegamentoipertestuale"/>
@@ -6487,7 +6499,7 @@
                 <w:noProof/>
                 <w:webHidden/>
               </w:rPr>
-              <w:instrText xml:space="preserve"> PAGEREF _Toc242794437 \h </w:instrText>
+              <w:instrText xml:space="preserve"> PAGEREF _Toc242796279 \h </w:instrText>
             </w:r>
             <w:r>
               <w:rPr>
@@ -6564,7 +6576,7 @@
           <w:lang w:val="it-IT"/>
         </w:rPr>
       </w:pPr>
-      <w:bookmarkStart w:id="0" w:name="_Toc242794388"/>
+      <w:bookmarkStart w:id="0" w:name="_Toc242796230"/>
       <w:r>
         <w:rPr>
           <w:lang w:val="it-IT"/>
@@ -6706,7 +6718,7 @@
           <w:lang w:val="it-IT"/>
         </w:rPr>
       </w:pPr>
-      <w:bookmarkStart w:id="1" w:name="_Toc242794389"/>
+      <w:bookmarkStart w:id="1" w:name="_Toc242796231"/>
       <w:r>
         <w:rPr>
           <w:lang w:val="it-IT"/>
@@ -6764,7 +6776,7 @@
           <w:lang w:val="it-IT"/>
         </w:rPr>
       </w:pPr>
-      <w:bookmarkStart w:id="2" w:name="_Toc242794390"/>
+      <w:bookmarkStart w:id="2" w:name="_Toc242796232"/>
       <w:r>
         <w:rPr>
           <w:lang w:val="it-IT"/>
@@ -7204,7 +7216,7 @@
           <w:lang w:val="it-IT"/>
         </w:rPr>
       </w:pPr>
-      <w:bookmarkStart w:id="3" w:name="_Toc242794391"/>
+      <w:bookmarkStart w:id="3" w:name="_Toc242796233"/>
       <w:r>
         <w:rPr>
           <w:lang w:val="it-IT"/>
@@ -8191,7 +8203,7 @@
           <w:lang w:val="it-IT"/>
         </w:rPr>
       </w:pPr>
-      <w:bookmarkStart w:id="4" w:name="_Toc242794392"/>
+      <w:bookmarkStart w:id="4" w:name="_Toc242796234"/>
       <w:r>
         <w:rPr>
           <w:lang w:val="it-IT"/>
@@ -8438,7 +8450,7 @@
           <w:lang w:val="it-IT"/>
         </w:rPr>
       </w:pPr>
-      <w:bookmarkStart w:id="5" w:name="_Toc242794393"/>
+      <w:bookmarkStart w:id="5" w:name="_Toc242796235"/>
       <w:r>
         <w:rPr>
           <w:lang w:val="it-IT"/>
@@ -8470,7 +8482,7 @@
           <w:lang w:val="it-IT"/>
         </w:rPr>
       </w:pPr>
-      <w:bookmarkStart w:id="6" w:name="_Toc242794394"/>
+      <w:bookmarkStart w:id="6" w:name="_Toc242796236"/>
       <w:r>
         <w:rPr>
           <w:lang w:val="it-IT"/>
@@ -9801,7 +9813,7 @@
           <w:lang w:val="it-IT"/>
         </w:rPr>
       </w:pPr>
-      <w:bookmarkStart w:id="7" w:name="_Toc242794395"/>
+      <w:bookmarkStart w:id="7" w:name="_Toc242796237"/>
       <w:r>
         <w:rPr>
           <w:lang w:val="it-IT"/>
@@ -10036,7 +10048,7 @@
           <w:lang w:val="it-IT"/>
         </w:rPr>
       </w:pPr>
-      <w:bookmarkStart w:id="8" w:name="_Toc242794396"/>
+      <w:bookmarkStart w:id="8" w:name="_Toc242796238"/>
       <w:r>
         <w:rPr>
           <w:lang w:val="it-IT"/>
@@ -10141,7 +10153,7 @@
           <w:lang w:val="it-IT"/>
         </w:rPr>
       </w:pPr>
-      <w:bookmarkStart w:id="9" w:name="_Toc242794397"/>
+      <w:bookmarkStart w:id="9" w:name="_Toc242796239"/>
       <w:r>
         <w:rPr>
           <w:lang w:val="it-IT"/>
@@ -10206,7 +10218,7 @@
           <w:lang w:val="it-IT"/>
         </w:rPr>
       </w:pPr>
-      <w:bookmarkStart w:id="10" w:name="_Toc242794398"/>
+      <w:bookmarkStart w:id="10" w:name="_Toc242796240"/>
       <w:r>
         <w:rPr>
           <w:lang w:val="it-IT"/>
@@ -13736,7 +13748,7 @@
           <w:lang w:val="it-IT"/>
         </w:rPr>
       </w:pPr>
-      <w:bookmarkStart w:id="11" w:name="_Toc242794399"/>
+      <w:bookmarkStart w:id="11" w:name="_Toc242796241"/>
       <w:r>
         <w:rPr>
           <w:lang w:val="it-IT"/>
@@ -13753,7 +13765,7 @@
           <w:lang w:val="it-IT"/>
         </w:rPr>
       </w:pPr>
-      <w:bookmarkStart w:id="12" w:name="_Toc242794400"/>
+      <w:bookmarkStart w:id="12" w:name="_Toc242796242"/>
       <w:r>
         <w:rPr>
           <w:lang w:val="it-IT"/>
@@ -13928,7 +13940,7 @@
           <w:lang w:val="it-IT"/>
         </w:rPr>
       </w:pPr>
-      <w:bookmarkStart w:id="13" w:name="_Toc242794401"/>
+      <w:bookmarkStart w:id="13" w:name="_Toc242796243"/>
       <w:r>
         <w:rPr>
           <w:lang w:val="it-IT"/>
@@ -14105,7 +14117,7 @@
           <w:lang w:val="it-IT"/>
         </w:rPr>
       </w:pPr>
-      <w:bookmarkStart w:id="14" w:name="_Toc242794402"/>
+      <w:bookmarkStart w:id="14" w:name="_Toc242796244"/>
       <w:r>
         <w:rPr>
           <w:lang w:val="it-IT"/>
@@ -15008,7 +15020,7 @@
           <w:lang w:val="it-IT"/>
         </w:rPr>
       </w:pPr>
-      <w:bookmarkStart w:id="15" w:name="_Toc242794403"/>
+      <w:bookmarkStart w:id="15" w:name="_Toc242796245"/>
       <w:r>
         <w:rPr>
           <w:lang w:val="it-IT"/>
@@ -15385,7 +15397,7 @@
           <w:lang w:val="it-IT"/>
         </w:rPr>
       </w:pPr>
-      <w:bookmarkStart w:id="16" w:name="_Toc242794404"/>
+      <w:bookmarkStart w:id="16" w:name="_Toc242796246"/>
       <w:r>
         <w:rPr>
           <w:lang w:val="it-IT"/>
@@ -15743,7 +15755,7 @@
           <w:lang w:val="it-IT"/>
         </w:rPr>
       </w:pPr>
-      <w:bookmarkStart w:id="17" w:name="_Toc242794405"/>
+      <w:bookmarkStart w:id="17" w:name="_Toc242796247"/>
       <w:r>
         <w:rPr>
           <w:lang w:val="it-IT"/>
@@ -15763,7 +15775,19 @@
         <w:rPr>
           <w:lang w:val="it-IT"/>
         </w:rPr>
-        <w:t xml:space="preserve">È l’opzione A delle analisi di partenza e la via più breve per sostituire gli header. La libreria di profilazione diventa il componente che dialoga con IAM: punto di ingresso, callback, scambio fuori banda, convalida del </w:t>
+        <w:t xml:space="preserve">È l’opzione </w:t>
+      </w:r>
+      <w:r>
+        <w:rPr>
+          <w:lang w:val="it-IT"/>
+        </w:rPr>
+        <w:t>preferibile</w:t>
+      </w:r>
+      <w:r>
+        <w:rPr>
+          <w:lang w:val="it-IT"/>
+        </w:rPr>
+        <w:t xml:space="preserve"> delle analisi di partenza e la via più breve per sostituire gli header. La libreria di profilazione diventa il componente che dialoga con IAM: punto di ingresso, callback, scambio fuori banda, convalida del </w:t>
       </w:r>
       <w:r>
         <w:rPr>
@@ -16011,6 +16035,7 @@
                 <w:sz w:val="18"/>
                 <w:lang w:val="it-IT"/>
               </w:rPr>
+              <w:lastRenderedPageBreak/>
               <w:t>Reversibile, se scritta dietro un’interfaccia che separi il reindirizzamento dal ritorno.</w:t>
             </w:r>
           </w:p>
@@ -16114,7 +16139,7 @@
           <w:lang w:val="it-IT"/>
         </w:rPr>
       </w:pPr>
-      <w:bookmarkStart w:id="18" w:name="_Toc242794406"/>
+      <w:bookmarkStart w:id="18" w:name="_Toc242796248"/>
       <w:r>
         <w:rPr>
           <w:lang w:val="it-IT"/>
@@ -16518,7 +16543,7 @@
           <w:lang w:val="it-IT"/>
         </w:rPr>
       </w:pPr>
-      <w:bookmarkStart w:id="19" w:name="_Toc242794407"/>
+      <w:bookmarkStart w:id="19" w:name="_Toc242796249"/>
       <w:r>
         <w:rPr>
           <w:lang w:val="it-IT"/>
@@ -16550,7 +16575,14 @@
         <w:rPr>
           <w:lang w:val="it-IT"/>
         </w:rPr>
-        <w:t xml:space="preserve"> di SIPO, firmati asimmetricamente e con i claim applicativi — identificativo dell’utente, ruoli, profilo, organizzazione, postazione. I back-end smettono di essere emittenti e diventano soltanto verificatori.</w:t>
+        <w:t xml:space="preserve"> di SIPO, firmati asimmetricamente e con i claim applicativi — identificativo </w:t>
+      </w:r>
+      <w:r>
+        <w:rPr>
+          <w:lang w:val="it-IT"/>
+        </w:rPr>
+        <w:lastRenderedPageBreak/>
+        <w:t>dell’utente, ruoli, profilo, organizzazione, postazione. I back-end smettono di essere emittenti e diventano soltanto verificatori.</w:t>
       </w:r>
     </w:p>
     <w:p>
@@ -16564,7 +16596,6 @@
         <w:rPr>
           <w:lang w:val="it-IT"/>
         </w:rPr>
-        <w:lastRenderedPageBreak/>
         <w:t xml:space="preserve">È la soluzione architetturalmente più pulita fra quelle che comportano una costruzione: </w:t>
       </w:r>
       <w:r>
@@ -17087,8 +17118,29 @@
         <w:t>invece di costruire il gateway di S3 come servizio di sola autenticazione, lo si costruisce come BFF</w:t>
       </w:r>
       <w:r>
-        <w:t>, cioè gli si fa attraversare anche il traffico applicativo delle nuove applicazioni Angular. Il componente è lo stesso; cambia quanto gli si fa fare.</w:t>
-      </w:r>
+        <w:t xml:space="preserve">, cioè gli si fa attraversare anche il traffico applicativo delle nuove applicazioni Angular. Il componente è lo stesso; cambia quanto </w:t>
+      </w:r>
+      <w:proofErr w:type="spellStart"/>
+      <w:r>
+        <w:t>gli</w:t>
+      </w:r>
+      <w:proofErr w:type="spellEnd"/>
+      <w:r>
+        <w:t xml:space="preserve"> </w:t>
+      </w:r>
+      <w:proofErr w:type="spellStart"/>
+      <w:r>
+        <w:t>si</w:t>
+      </w:r>
+      <w:proofErr w:type="spellEnd"/>
+      <w:r>
+        <w:t xml:space="preserve"> fa fare.</w:t>
+      </w:r>
+    </w:p>
+    <w:p>
+      <w:pPr>
+        <w:jc w:val="both"/>
+      </w:pPr>
     </w:p>
     <w:p>
       <w:pPr>
@@ -17130,6 +17182,7 @@
                 <w:b/>
                 <w:sz w:val="18"/>
               </w:rPr>
+              <w:lastRenderedPageBreak/>
               <w:t>Problema</w:t>
             </w:r>
           </w:p>
@@ -17456,7 +17509,6 @@
               <w:rPr>
                 <w:sz w:val="18"/>
               </w:rPr>
-              <w:lastRenderedPageBreak/>
               <w:t>L’identità non arriva ai back-end</w:t>
             </w:r>
           </w:p>
@@ -18115,11 +18167,12 @@
           <w:lang w:val="it-IT"/>
         </w:rPr>
       </w:pPr>
-      <w:bookmarkStart w:id="20" w:name="_Toc242794408"/>
-      <w:r>
-        <w:rPr>
-          <w:lang w:val="it-IT"/>
-        </w:rPr>
+      <w:bookmarkStart w:id="20" w:name="_Toc242796250"/>
+      <w:r>
+        <w:rPr>
+          <w:lang w:val="it-IT"/>
+        </w:rPr>
+        <w:lastRenderedPageBreak/>
         <w:t>S4 — Convergenza sul servizio che già esiste</w:t>
       </w:r>
       <w:bookmarkEnd w:id="20"/>
@@ -18204,7 +18257,6 @@
           <w:bCs/>
           <w:lang w:val="it-IT"/>
         </w:rPr>
-        <w:lastRenderedPageBreak/>
         <w:t>/</w:t>
       </w:r>
       <w:proofErr w:type="spellStart"/>
@@ -18561,7 +18613,7 @@
           <w:lang w:val="it-IT"/>
         </w:rPr>
       </w:pPr>
-      <w:bookmarkStart w:id="21" w:name="_Toc242794409"/>
+      <w:bookmarkStart w:id="21" w:name="_Toc242796251"/>
       <w:r>
         <w:rPr>
           <w:lang w:val="it-IT"/>
@@ -18885,7 +18937,11 @@
               </w:rPr>
             </w:pPr>
             <w:r>
-              <w:t>un client con 35 redirect, oppure 35 client</w:t>
+              <w:t xml:space="preserve">un client con 35 redirect, </w:t>
+            </w:r>
+            <w:r>
+              <w:lastRenderedPageBreak/>
+              <w:t>oppure 35 client</w:t>
             </w:r>
           </w:p>
         </w:tc>
@@ -18905,6 +18961,7 @@
                 <w:sz w:val="18"/>
                 <w:lang w:val="it-IT"/>
               </w:rPr>
+              <w:lastRenderedPageBreak/>
               <w:t>1</w:t>
             </w:r>
           </w:p>
@@ -19004,11 +19061,7 @@
               </w:rPr>
             </w:pPr>
             <w:r>
-              <w:t xml:space="preserve">in ciascuno </w:t>
-            </w:r>
-            <w:r>
-              <w:lastRenderedPageBreak/>
-              <w:t>dei 35 front-end</w:t>
+              <w:t>in ciascuno dei 35 front-end</w:t>
             </w:r>
           </w:p>
         </w:tc>
@@ -19028,7 +19081,6 @@
                 <w:sz w:val="18"/>
                 <w:lang w:val="it-IT"/>
               </w:rPr>
-              <w:lastRenderedPageBreak/>
               <w:t>nel Broker</w:t>
             </w:r>
           </w:p>
@@ -19829,7 +19881,7 @@
           <w:lang w:val="it-IT"/>
         </w:rPr>
       </w:pPr>
-      <w:bookmarkStart w:id="22" w:name="_Toc242794410"/>
+      <w:bookmarkStart w:id="22" w:name="_Toc242796252"/>
       <w:r>
         <w:rPr>
           <w:lang w:val="it-IT"/>
@@ -20355,6 +20407,7 @@
                 <w:sz w:val="17"/>
                 <w:lang w:val="it-IT"/>
               </w:rPr>
+              <w:lastRenderedPageBreak/>
               <w:t>RI-16 Solo il primo ruolo</w:t>
             </w:r>
           </w:p>
@@ -20555,7 +20608,6 @@
                 <w:sz w:val="17"/>
                 <w:lang w:val="it-IT"/>
               </w:rPr>
-              <w:lastRenderedPageBreak/>
               <w:t>RI-13 Impostazioni permissive</w:t>
             </w:r>
           </w:p>
@@ -21002,7 +21054,7 @@
           <w:lang w:val="it-IT"/>
         </w:rPr>
       </w:pPr>
-      <w:bookmarkStart w:id="23" w:name="_Toc242794411"/>
+      <w:bookmarkStart w:id="23" w:name="_Toc242796253"/>
       <w:r>
         <w:rPr>
           <w:lang w:val="it-IT"/>
@@ -21689,7 +21741,7 @@
           <w:lang w:val="it-IT"/>
         </w:rPr>
       </w:pPr>
-      <w:bookmarkStart w:id="24" w:name="_Toc242794412"/>
+      <w:bookmarkStart w:id="24" w:name="_Toc242796254"/>
       <w:r>
         <w:rPr>
           <w:lang w:val="it-IT"/>
@@ -22145,6 +22197,7 @@
                 <w:sz w:val="17"/>
                 <w:lang w:val="it-IT"/>
               </w:rPr>
+              <w:lastRenderedPageBreak/>
               <w:t>Perdita delle intestazioni di infrastruttura: la postazione ANPR</w:t>
             </w:r>
           </w:p>
@@ -22406,7 +22459,6 @@
                 <w:sz w:val="17"/>
                 <w:lang w:val="it-IT"/>
               </w:rPr>
-              <w:lastRenderedPageBreak/>
               <w:t>I servizi restano aperti nonostante l’accesso nuovo</w:t>
             </w:r>
           </w:p>
@@ -22501,7 +22553,7 @@
           <w:lang w:val="it-IT"/>
         </w:rPr>
       </w:pPr>
-      <w:bookmarkStart w:id="25" w:name="_Toc242794413"/>
+      <w:bookmarkStart w:id="25" w:name="_Toc242796255"/>
       <w:r>
         <w:rPr>
           <w:lang w:val="it-IT"/>
@@ -24486,7 +24538,7 @@
           <w:lang w:val="it-IT"/>
         </w:rPr>
       </w:pPr>
-      <w:bookmarkStart w:id="26" w:name="_Toc242794414"/>
+      <w:bookmarkStart w:id="26" w:name="_Toc242796256"/>
       <w:r>
         <w:rPr>
           <w:lang w:val="it-IT"/>
@@ -24509,7 +24561,7 @@
         <w:pStyle w:val="Titolo2"/>
         <w:jc w:val="both"/>
       </w:pPr>
-      <w:bookmarkStart w:id="27" w:name="_Toc242794415"/>
+      <w:bookmarkStart w:id="27" w:name="_Toc242796257"/>
       <w:r>
         <w:t>La soluzione: un solo punto di autenticazione</w:t>
       </w:r>
@@ -25695,7 +25747,7 @@
         <w:pStyle w:val="Titolo2"/>
         <w:jc w:val="both"/>
       </w:pPr>
-      <w:bookmarkStart w:id="28" w:name="_Toc242794416"/>
+      <w:bookmarkStart w:id="28" w:name="_Toc242796258"/>
       <w:r>
         <w:t>Perché non si comincia dalla libreria</w:t>
       </w:r>
@@ -26168,7 +26220,7 @@
         <w:pStyle w:val="Titolo2"/>
         <w:jc w:val="both"/>
       </w:pPr>
-      <w:bookmarkStart w:id="29" w:name="_Toc242794417"/>
+      <w:bookmarkStart w:id="29" w:name="_Toc242796259"/>
       <w:r>
         <w:t>Il login di un operatore</w:t>
       </w:r>
@@ -26321,7 +26373,31 @@
       </w:r>
       <w:proofErr w:type="spellEnd"/>
       <w:r>
-        <w:t xml:space="preserve"> caso si presenta all’operatore come un generico «utente senza ruoli» e manda il supporto a cercare nel posto sbagliato.</w:t>
+        <w:t xml:space="preserve"> </w:t>
+      </w:r>
+      <w:proofErr w:type="spellStart"/>
+      <w:r>
+        <w:t>caso</w:t>
+      </w:r>
+      <w:proofErr w:type="spellEnd"/>
+      <w:r>
+        <w:t xml:space="preserve"> </w:t>
+      </w:r>
+      <w:proofErr w:type="spellStart"/>
+      <w:r>
+        <w:t>si</w:t>
+      </w:r>
+      <w:proofErr w:type="spellEnd"/>
+      <w:r>
+        <w:t xml:space="preserve"> </w:t>
+      </w:r>
+      <w:proofErr w:type="spellStart"/>
+      <w:r>
+        <w:t>presenta</w:t>
+      </w:r>
+      <w:proofErr w:type="spellEnd"/>
+      <w:r>
+        <w:t xml:space="preserve"> all’operatore come un generico «utente senza ruoli» e manda il supporto a cercare nel posto sbagliato.</w:t>
       </w:r>
     </w:p>
     <w:p>
@@ -26527,7 +26603,7 @@
         <w:pStyle w:val="Titolo2"/>
         <w:jc w:val="both"/>
       </w:pPr>
-      <w:bookmarkStart w:id="30" w:name="_Toc242794418"/>
+      <w:bookmarkStart w:id="30" w:name="_Toc242796260"/>
       <w:r>
         <w:t>Il login di un cittadino e il contesto operativo</w:t>
       </w:r>
@@ -26594,7 +26670,7 @@
         <w:pStyle w:val="Titolo2"/>
         <w:jc w:val="both"/>
       </w:pPr>
-      <w:bookmarkStart w:id="31" w:name="_Toc242794419"/>
+      <w:bookmarkStart w:id="31" w:name="_Toc242796261"/>
       <w:r>
         <w:t xml:space="preserve">Le </w:t>
       </w:r>
@@ -26704,7 +26780,7 @@
         <w:pStyle w:val="Titolo2"/>
         <w:jc w:val="both"/>
       </w:pPr>
-      <w:bookmarkStart w:id="32" w:name="_Toc242794420"/>
+      <w:bookmarkStart w:id="32" w:name="_Toc242796262"/>
       <w:proofErr w:type="spellStart"/>
       <w:r>
         <w:t>Scadenza</w:t>
@@ -26902,7 +26978,23 @@
       </w:r>
       <w:proofErr w:type="gramEnd"/>
       <w:r>
-        <w:t xml:space="preserve"> ha già una sessione continua a lavorare fino alla scadenza; </w:t>
+        <w:t xml:space="preserve"> ha già una sessione continua a lavorare </w:t>
+      </w:r>
+      <w:proofErr w:type="spellStart"/>
+      <w:r>
+        <w:t>fino</w:t>
+      </w:r>
+      <w:proofErr w:type="spellEnd"/>
+      <w:r>
+        <w:t xml:space="preserve"> alla </w:t>
+      </w:r>
+      <w:proofErr w:type="spellStart"/>
+      <w:r>
+        <w:t>scadenza</w:t>
+      </w:r>
+      <w:proofErr w:type="spellEnd"/>
+      <w:r>
+        <w:t xml:space="preserve">; </w:t>
       </w:r>
       <w:proofErr w:type="spellStart"/>
       <w:r>
@@ -27077,7 +27169,7 @@
         <w:pStyle w:val="Titolo2"/>
         <w:jc w:val="both"/>
       </w:pPr>
-      <w:bookmarkStart w:id="33" w:name="_Toc242794421"/>
+      <w:bookmarkStart w:id="33" w:name="_Toc242796263"/>
       <w:r>
         <w:lastRenderedPageBreak/>
         <w:t>Come ci si arriva: due sequenze</w:t>
@@ -27568,7 +27660,7 @@
         <w:pStyle w:val="Titolo2"/>
         <w:jc w:val="both"/>
       </w:pPr>
-      <w:bookmarkStart w:id="34" w:name="_Toc242794422"/>
+      <w:bookmarkStart w:id="34" w:name="_Toc242796264"/>
       <w:r>
         <w:t>La sostenibilità sull’architettura di destinazione</w:t>
       </w:r>
@@ -28442,7 +28534,7 @@
         <w:pStyle w:val="Titolo2"/>
         <w:jc w:val="both"/>
       </w:pPr>
-      <w:bookmarkStart w:id="35" w:name="_Toc242794423"/>
+      <w:bookmarkStart w:id="35" w:name="_Toc242796265"/>
       <w:r>
         <w:t>Che cosa cambia rispetto a oggi</w:t>
       </w:r>
@@ -29022,7 +29114,7 @@
         <w:pStyle w:val="Titolo2"/>
         <w:jc w:val="both"/>
       </w:pPr>
-      <w:bookmarkStart w:id="36" w:name="_Toc242794424"/>
+      <w:bookmarkStart w:id="36" w:name="_Toc242796266"/>
       <w:r>
         <w:t>Prerequisiti e adempimenti</w:t>
       </w:r>
@@ -29406,7 +29498,15 @@
       </w:r>
       <w:proofErr w:type="gramEnd"/>
       <w:r>
-        <w:t xml:space="preserve"> non hanno una clausola che chiuda tutto ciò che non è esplicitamente consentito: finché resta così, un accesso robusto davanti a servizi aperti non migliora la sicurezza complessiva. Si fa in giorni e non dipende da nessuna delle </w:t>
+        <w:t xml:space="preserve"> non hanno una clausola che chiuda tutto ciò che non è esplicitamente consentito: finché resta così, un accesso robusto davanti a servizi aperti non migliora la sicurezza complessiva. Si fa in giorni e non dipende da </w:t>
+      </w:r>
+      <w:proofErr w:type="spellStart"/>
+      <w:r>
+        <w:t>nessuna</w:t>
+      </w:r>
+      <w:proofErr w:type="spellEnd"/>
+      <w:r>
+        <w:t xml:space="preserve"> delle </w:t>
       </w:r>
       <w:proofErr w:type="spellStart"/>
       <w:r>
@@ -29443,7 +29543,7 @@
         <w:pStyle w:val="Titolo1"/>
         <w:jc w:val="both"/>
       </w:pPr>
-      <w:bookmarkStart w:id="37" w:name="_Toc242794425"/>
+      <w:bookmarkStart w:id="37" w:name="_Toc242796267"/>
       <w:r>
         <w:lastRenderedPageBreak/>
         <w:t>I ruoli: che cosa porta IAM e come si introducono</w:t>
@@ -29463,7 +29563,7 @@
         <w:pStyle w:val="Titolo2"/>
         <w:jc w:val="both"/>
       </w:pPr>
-      <w:bookmarkStart w:id="38" w:name="_Toc242794426"/>
+      <w:bookmarkStart w:id="38" w:name="_Toc242796268"/>
       <w:r>
         <w:t>Che cosa porta IAM, e che cosa non porta</w:t>
       </w:r>
@@ -30192,7 +30292,7 @@
         <w:pStyle w:val="Titolo2"/>
         <w:jc w:val="both"/>
       </w:pPr>
-      <w:bookmarkStart w:id="39" w:name="_Toc242794427"/>
+      <w:bookmarkStart w:id="39" w:name="_Toc242796269"/>
       <w:r>
         <w:t>Perché i gruppi LDAP non possono fare i ruoli di SIPO</w:t>
       </w:r>
@@ -30281,7 +30381,7 @@
         <w:pStyle w:val="Titolo2"/>
         <w:jc w:val="both"/>
       </w:pPr>
-      <w:bookmarkStart w:id="40" w:name="_Toc242794428"/>
+      <w:bookmarkStart w:id="40" w:name="_Toc242796270"/>
       <w:r>
         <w:lastRenderedPageBreak/>
         <w:t>Lo stato di fatto: un ruolo, quattro nomi</w:t>
@@ -30623,7 +30723,7 @@
         <w:pStyle w:val="Titolo2"/>
         <w:jc w:val="both"/>
       </w:pPr>
-      <w:bookmarkStart w:id="41" w:name="_Toc242794429"/>
+      <w:bookmarkStart w:id="41" w:name="_Toc242796271"/>
       <w:r>
         <w:t>Il permesso è una quaterna, non un’appartenenza</w:t>
       </w:r>
@@ -30730,7 +30830,23 @@
         <w:t xml:space="preserve">. </w:t>
       </w:r>
       <w:r>
-        <w:t xml:space="preserve">Ogni utente nuovo va abilitato funzionalità per funzionalità, ed è esattamente il lavoro che il </w:t>
+        <w:t xml:space="preserve">Ogni utente nuovo va abilitato funzionalità per funzionalità, ed è esattamente il </w:t>
+      </w:r>
+      <w:proofErr w:type="spellStart"/>
+      <w:r>
+        <w:t>lavoro</w:t>
+      </w:r>
+      <w:proofErr w:type="spellEnd"/>
+      <w:r>
+        <w:t xml:space="preserve"> </w:t>
+      </w:r>
+      <w:proofErr w:type="spellStart"/>
+      <w:r>
+        <w:t>che</w:t>
+      </w:r>
+      <w:proofErr w:type="spellEnd"/>
+      <w:r>
+        <w:t xml:space="preserve"> il </w:t>
       </w:r>
       <w:proofErr w:type="spellStart"/>
       <w:r>
@@ -30767,7 +30883,7 @@
         <w:pStyle w:val="Titolo2"/>
         <w:jc w:val="both"/>
       </w:pPr>
-      <w:bookmarkStart w:id="42" w:name="_Toc242794430"/>
+      <w:bookmarkStart w:id="42" w:name="_Toc242796272"/>
       <w:r>
         <w:lastRenderedPageBreak/>
         <w:t xml:space="preserve">Che cosa i ruoli proteggono oggi: il menu, </w:t>
@@ -31202,7 +31318,35 @@
               <w:rPr>
                 <w:sz w:val="18"/>
               </w:rPr>
-              <w:t xml:space="preserve"> nel modello e non è usato da nessuna parte: il multi-ruolo è previsto e non governato.</w:t>
+              <w:t xml:space="preserve"> </w:t>
+            </w:r>
+            <w:proofErr w:type="spellStart"/>
+            <w:r>
+              <w:rPr>
+                <w:sz w:val="18"/>
+              </w:rPr>
+              <w:t>nel</w:t>
+            </w:r>
+            <w:proofErr w:type="spellEnd"/>
+            <w:r>
+              <w:rPr>
+                <w:sz w:val="18"/>
+              </w:rPr>
+              <w:t xml:space="preserve"> </w:t>
+            </w:r>
+            <w:proofErr w:type="spellStart"/>
+            <w:r>
+              <w:rPr>
+                <w:sz w:val="18"/>
+              </w:rPr>
+              <w:t>modello</w:t>
+            </w:r>
+            <w:proofErr w:type="spellEnd"/>
+            <w:r>
+              <w:rPr>
+                <w:sz w:val="18"/>
+              </w:rPr>
+              <w:t xml:space="preserve"> e non è usato da nessuna parte: il multi-ruolo è previsto e non governato.</w:t>
             </w:r>
           </w:p>
         </w:tc>
@@ -31230,10 +31374,7 @@
         <w:jc w:val="both"/>
       </w:pPr>
       <w:r>
-        <w:t>I</w:t>
-      </w:r>
-      <w:r>
-        <w:t>l menu ha uno strato cablato sopra il dato: il metodo che riceve le aree tematiche decide le macro-sezioni con identificativi numerici scritti nel codice (l’ambito dello stato civile, un elenco di aree per il dipartimento, un altro per i municipi, e sette esclusioni per l’elettorale). Aggiungere un’area o una funzionalità non accende il menu da sola: è il motivo per cui le pagine nuove conviene registrarle in un’area esistente dell’ambito dello stato civile.</w:t>
+        <w:t>Il menu ha uno strato cablato sopra il dato: il metodo che riceve le aree tematiche decide le macro-sezioni con identificativi numerici scritti nel codice (l’ambito dello stato civile, un elenco di aree per il dipartimento, un altro per i municipi, e sette esclusioni per l’elettorale). Aggiungere un’area o una funzionalità non accende il menu da sola: è il motivo per cui le pagine nuove conviene registrarle in un’area esistente dell’ambito dello stato civile.</w:t>
       </w:r>
     </w:p>
     <w:p>
@@ -31241,7 +31382,7 @@
         <w:pStyle w:val="Titolo2"/>
         <w:jc w:val="both"/>
       </w:pPr>
-      <w:bookmarkStart w:id="43" w:name="_Toc242794431"/>
+      <w:bookmarkStart w:id="43" w:name="_Toc242796273"/>
       <w:r>
         <w:t>Come si introducono: due livelli, un registro</w:t>
       </w:r>
@@ -31734,8 +31875,16 @@
         <w:rPr>
           <w:bCs/>
         </w:rPr>
-        <w:t xml:space="preserve"> le righe</w:t>
-      </w:r>
+        <w:t xml:space="preserve"> le </w:t>
+      </w:r>
+      <w:proofErr w:type="spellStart"/>
+      <w:r>
+        <w:rPr>
+          <w:bCs/>
+        </w:rPr>
+        <w:t>righe</w:t>
+      </w:r>
+      <w:proofErr w:type="spellEnd"/>
       <w:r>
         <w:t xml:space="preserve"> dalla matrice. La colonna COD_ORIGINE distingue le righe derivate da quelle messe a mano: è la stessa primitiva già adottata per la configurazione dei campi del nuovo componente, e serve allo stesso scopo — cambiare regime senza perdere il lavoro fatto. La riassegnazione riscrive solo le righe derivate; le eccezioni restano, sono visibili e si possono elencare.</w:t>
       </w:r>
@@ -31745,10 +31894,7 @@
         <w:jc w:val="both"/>
       </w:pPr>
       <w:r>
-        <w:t>I</w:t>
-      </w:r>
-      <w:r>
-        <w:t xml:space="preserve">l </w:t>
+        <w:t xml:space="preserve">Il </w:t>
       </w:r>
       <w:proofErr w:type="spellStart"/>
       <w:r>
@@ -31782,7 +31928,7 @@
         <w:pStyle w:val="Titolo2"/>
         <w:jc w:val="both"/>
       </w:pPr>
-      <w:bookmarkStart w:id="44" w:name="_Toc242794432"/>
+      <w:bookmarkStart w:id="44" w:name="_Toc242796274"/>
       <w:r>
         <w:t>La matrice iniziale si ricava dai dati, non si scrive a mano</w:t>
       </w:r>
@@ -32176,7 +32322,23 @@
       </w:r>
       <w:proofErr w:type="spellEnd"/>
       <w:r>
-        <w:t xml:space="preserve"> regime va prodotto il </w:t>
+        <w:t xml:space="preserve"> regime </w:t>
+      </w:r>
+      <w:proofErr w:type="spellStart"/>
+      <w:r>
+        <w:t>va</w:t>
+      </w:r>
+      <w:proofErr w:type="spellEnd"/>
+      <w:r>
+        <w:t xml:space="preserve"> </w:t>
+      </w:r>
+      <w:proofErr w:type="spellStart"/>
+      <w:r>
+        <w:t>prodotto</w:t>
+      </w:r>
+      <w:proofErr w:type="spellEnd"/>
+      <w:r>
+        <w:t xml:space="preserve"> il </w:t>
       </w:r>
       <w:r>
         <w:rPr>
@@ -32193,7 +32355,7 @@
         <w:pStyle w:val="Titolo2"/>
         <w:jc w:val="both"/>
       </w:pPr>
-      <w:bookmarkStart w:id="45" w:name="_Toc242794433"/>
+      <w:bookmarkStart w:id="45" w:name="_Toc242796275"/>
       <w:r>
         <w:t>Il primo ruolo, e la riga che lo rende deterministico</w:t>
       </w:r>
@@ -32277,7 +32439,7 @@
         <w:pStyle w:val="Titolo2"/>
         <w:jc w:val="both"/>
       </w:pPr>
-      <w:bookmarkStart w:id="46" w:name="_Toc242794434"/>
+      <w:bookmarkStart w:id="46" w:name="_Toc242796276"/>
       <w:r>
         <w:t>Dove si amministra</w:t>
       </w:r>
@@ -32296,7 +32458,7 @@
         <w:pStyle w:val="Titolo2"/>
         <w:jc w:val="both"/>
       </w:pPr>
-      <w:bookmarkStart w:id="47" w:name="_Toc242794435"/>
+      <w:bookmarkStart w:id="47" w:name="_Toc242796277"/>
       <w:r>
         <w:lastRenderedPageBreak/>
         <w:t>Due possibilità ancora aperte: una matrice o due</w:t>
@@ -32594,7 +32756,7 @@
         <w:pStyle w:val="Titolo2"/>
         <w:jc w:val="both"/>
       </w:pPr>
-      <w:bookmarkStart w:id="48" w:name="_Toc242794436"/>
+      <w:bookmarkStart w:id="48" w:name="_Toc242796278"/>
       <w:r>
         <w:t>Come i ruoli e i gruppi arrivano nelle pagine Thymeleaf</w:t>
       </w:r>
@@ -33200,7 +33362,7 @@
         <w:pStyle w:val="Titolo2"/>
         <w:jc w:val="both"/>
       </w:pPr>
-      <w:bookmarkStart w:id="49" w:name="_Toc242794437"/>
+      <w:bookmarkStart w:id="49" w:name="_Toc242796279"/>
       <w:r>
         <w:t>La verifica preliminare</w:t>
       </w:r>
@@ -33783,7 +33945,15 @@
               <w:sz w:val="22"/>
               <w:szCs w:val="22"/>
             </w:rPr>
-            <w:t xml:space="preserve"> v0.3</w:t>
+            <w:t xml:space="preserve"> v0.</w:t>
+          </w:r>
+          <w:r>
+            <w:rPr>
+              <w:noProof/>
+              <w:sz w:val="22"/>
+              <w:szCs w:val="22"/>
+            </w:rPr>
+            <w:t>5</w:t>
           </w:r>
         </w:p>
         <w:p>
@@ -36958,9 +37128,12 @@
 </file>
 
 <file path=customXml/item2.xml><?xml version="1.0" encoding="utf-8"?>
-<p:properties xmlns:p="http://schemas.microsoft.com/office/2006/metadata/properties" xmlns:xsi="http://www.w3.org/2001/XMLSchema-instance" xmlns:pc="http://schemas.microsoft.com/office/infopath/2007/PartnerControls">
-  <documentManagement/>
-</p:properties>
+<?mso-contentType ?>
+<FormTemplates xmlns="http://schemas.microsoft.com/sharepoint/v3/contenttype/forms">
+  <Display>DocumentLibraryForm</Display>
+  <Edit>DocumentLibraryForm</Edit>
+  <New>DocumentLibraryForm</New>
+</FormTemplates>
 </file>
 
 <file path=customXml/item3.xml><?xml version="1.0" encoding="utf-8"?>
@@ -36968,12 +37141,9 @@
 </file>
 
 <file path=customXml/item4.xml><?xml version="1.0" encoding="utf-8"?>
-<?mso-contentType ?>
-<FormTemplates xmlns="http://schemas.microsoft.com/sharepoint/v3/contenttype/forms">
-  <Display>DocumentLibraryForm</Display>
-  <Edit>DocumentLibraryForm</Edit>
-  <New>DocumentLibraryForm</New>
-</FormTemplates>
+<p:properties xmlns:p="http://schemas.microsoft.com/office/2006/metadata/properties" xmlns:xsi="http://www.w3.org/2001/XMLSchema-instance" xmlns:pc="http://schemas.microsoft.com/office/infopath/2007/PartnerControls">
+  <documentManagement/>
+</p:properties>
 </file>
 
 <file path=customXml/itemProps1.xml><?xml version="1.0" encoding="utf-8"?>
@@ -36995,10 +37165,9 @@
 </file>
 
 <file path=customXml/itemProps2.xml><?xml version="1.0" encoding="utf-8"?>
-<ds:datastoreItem xmlns:ds="http://schemas.openxmlformats.org/officeDocument/2006/customXml" ds:itemID="{DE4C094D-D12A-45EF-90D1-D76D17B6E427}">
+<ds:datastoreItem xmlns:ds="http://schemas.openxmlformats.org/officeDocument/2006/customXml" ds:itemID="{F99C4A69-2199-4F0E-B095-005F11429EED}">
   <ds:schemaRefs>
-    <ds:schemaRef ds:uri="http://schemas.microsoft.com/office/2006/metadata/properties"/>
-    <ds:schemaRef ds:uri="http://schemas.microsoft.com/office/infopath/2007/PartnerControls"/>
+    <ds:schemaRef ds:uri="http://schemas.microsoft.com/sharepoint/v3/contenttype/forms"/>
   </ds:schemaRefs>
 </ds:datastoreItem>
 </file>
@@ -37012,9 +37181,10 @@
 </file>
 
 <file path=customXml/itemProps4.xml><?xml version="1.0" encoding="utf-8"?>
-<ds:datastoreItem xmlns:ds="http://schemas.openxmlformats.org/officeDocument/2006/customXml" ds:itemID="{F99C4A69-2199-4F0E-B095-005F11429EED}">
+<ds:datastoreItem xmlns:ds="http://schemas.openxmlformats.org/officeDocument/2006/customXml" ds:itemID="{DE4C094D-D12A-45EF-90D1-D76D17B6E427}">
   <ds:schemaRefs>
-    <ds:schemaRef ds:uri="http://schemas.microsoft.com/sharepoint/v3/contenttype/forms"/>
+    <ds:schemaRef ds:uri="http://schemas.microsoft.com/office/2006/metadata/properties"/>
+    <ds:schemaRef ds:uri="http://schemas.microsoft.com/office/infopath/2007/PartnerControls"/>
   </ds:schemaRefs>
 </ds:datastoreItem>
 </file>

</xml_diff>